<commit_message>
docs: Route Optimization Studio — configurable constraints (no hardcoded counts)
Customer count is a user-set planning constraint, not a fixed system rule. Adds
the configurable constraint set (target/max customers per route, max visits per
day/week, target sales load) and auto-calculate route count derived from visit
workload rather than customer count. Targets are soft objectives; maximums are
hard caps; all are data + reusable company templates.

Co-Authored-By: Claude Opus 4.8 (1M context) <noreply@anthropic.com>
Claude-Session: https://claude.ai/code/session_01AnB42F2fTvBjmAfvzDNk4V
</commit_message>
<xml_diff>
--- a/docs/audits/Route-Optimization-Studio-Roadmap.docx
+++ b/docs/audits/Route-Optimization-Studio-Roadmap.docx
@@ -392,6 +392,443 @@
       </w:tr>
     </w:tbl>
     <w:p/>
+    <w:p>
+      <w:pPr>
+        <w:ind w:left="360"/>
+      </w:pPr>
+      <w:r>
+        <w:rPr>
+          <w:i/>
+        </w:rPr>
+      </w:r>
+      <w:r>
+        <w:rPr>
+          <w:i/>
+        </w:rPr>
+        <w:t xml:space="preserve">All numeric targets in this table are </w:t>
+      </w:r>
+      <w:r>
+        <w:rPr>
+          <w:b/>
+          <w:i/>
+        </w:rPr>
+        <w:t>examples</w:t>
+      </w:r>
+      <w:r>
+        <w:rPr>
+          <w:i/>
+        </w:rPr>
+        <w:t>, not system rules.</w:t>
+      </w:r>
+    </w:p>
+    <w:p>
+      <w:pPr>
+        <w:pStyle w:val="Heading2"/>
+      </w:pPr>
+      <w:r>
+        <w:rPr>
+          <w:color w:val="1F497D"/>
+        </w:rPr>
+        <w:t xml:space="preserve">1a. Configurable Constraints — </w:t>
+      </w:r>
+      <w:r>
+        <w:rPr>
+          <w:b/>
+          <w:color w:val="1F497D"/>
+        </w:rPr>
+        <w:t>no hardcoded counts</w:t>
+      </w:r>
+    </w:p>
+    <w:p>
+      <w:r>
+        <w:t xml:space="preserve">Customer count is a </w:t>
+      </w:r>
+      <w:r>
+        <w:rPr>
+          <w:b/>
+        </w:rPr>
+        <w:t>planning constraint set by the user</w:t>
+      </w:r>
+      <w:r>
+        <w:t>, never a fixed system rule.</w:t>
+      </w:r>
+    </w:p>
+    <w:p>
+      <w:r>
+        <w:t>Every example figure above (10 routes, ~120 customers, 35 visits/day) is illustrative</w:t>
+      </w:r>
+    </w:p>
+    <w:p>
+      <w:r>
+        <w:t xml:space="preserve">only. The optimizer must accept, and balance against, a </w:t>
+      </w:r>
+      <w:r>
+        <w:rPr>
+          <w:b/>
+        </w:rPr>
+        <w:t>fully user-configurable</w:t>
+      </w:r>
+    </w:p>
+    <w:p>
+      <w:r>
+        <w:t>constraint set:</w:t>
+      </w:r>
+    </w:p>
+    <w:tbl>
+      <w:tblPr>
+        <w:tblStyle w:val="LightGrid-Accent1"/>
+        <w:tblW w:type="auto" w:w="0"/>
+        <w:jc w:val="center"/>
+        <w:tblLook w:firstColumn="1" w:firstRow="1" w:lastColumn="0" w:lastRow="0" w:noHBand="0" w:noVBand="1" w:val="04A0"/>
+      </w:tblPr>
+      <w:tblGrid>
+        <w:gridCol w:w="2880"/>
+        <w:gridCol w:w="2880"/>
+        <w:gridCol w:w="2880"/>
+      </w:tblGrid>
+      <w:tr>
+        <w:tc>
+          <w:tcPr>
+            <w:tcW w:type="dxa" w:w="2880"/>
+            <w:shd w:val="clear" w:fill="1F497D"/>
+          </w:tcPr>
+          <w:p>
+            <w:r>
+              <w:rPr>
+                <w:b/>
+                <w:color w:val="FFFFFF"/>
+              </w:rPr>
+              <w:t>Constraint</w:t>
+            </w:r>
+          </w:p>
+        </w:tc>
+        <w:tc>
+          <w:tcPr>
+            <w:tcW w:type="dxa" w:w="2880"/>
+            <w:shd w:val="clear" w:fill="1F497D"/>
+          </w:tcPr>
+          <w:p>
+            <w:r>
+              <w:rPr>
+                <w:b/>
+                <w:color w:val="FFFFFF"/>
+              </w:rPr>
+              <w:t>Meaning</w:t>
+            </w:r>
+          </w:p>
+        </w:tc>
+        <w:tc>
+          <w:tcPr>
+            <w:tcW w:type="dxa" w:w="2880"/>
+            <w:shd w:val="clear" w:fill="1F497D"/>
+          </w:tcPr>
+          <w:p>
+            <w:r>
+              <w:rPr>
+                <w:b/>
+                <w:color w:val="FFFFFF"/>
+              </w:rPr>
+              <w:t>Default</w:t>
+            </w:r>
+          </w:p>
+        </w:tc>
+      </w:tr>
+      <w:tr>
+        <w:tc>
+          <w:tcPr>
+            <w:tcW w:type="dxa" w:w="2880"/>
+          </w:tcPr>
+          <w:p>
+            <w:r>
+              <w:t>Target customers per route</w:t>
+            </w:r>
+          </w:p>
+        </w:tc>
+        <w:tc>
+          <w:tcPr>
+            <w:tcW w:type="dxa" w:w="2880"/>
+          </w:tcPr>
+          <w:p>
+            <w:r>
+              <w:t>Soft target the balancer aims for</w:t>
+            </w:r>
+          </w:p>
+        </w:tc>
+        <w:tc>
+          <w:tcPr>
+            <w:tcW w:type="dxa" w:w="2880"/>
+          </w:tcPr>
+          <w:p>
+            <w:r>
+              <w:rPr>
+                <w:b/>
+              </w:rPr>
+              <w:t>User-set</w:t>
+            </w:r>
+            <w:r>
+              <w:t xml:space="preserve"> (no default count)</w:t>
+            </w:r>
+          </w:p>
+        </w:tc>
+      </w:tr>
+      <w:tr>
+        <w:tc>
+          <w:tcPr>
+            <w:tcW w:type="dxa" w:w="2880"/>
+          </w:tcPr>
+          <w:p>
+            <w:r>
+              <w:t>Maximum customers per route</w:t>
+            </w:r>
+          </w:p>
+        </w:tc>
+        <w:tc>
+          <w:tcPr>
+            <w:tcW w:type="dxa" w:w="2880"/>
+          </w:tcPr>
+          <w:p>
+            <w:r>
+              <w:t>Hard cap per route</w:t>
+            </w:r>
+          </w:p>
+        </w:tc>
+        <w:tc>
+          <w:tcPr>
+            <w:tcW w:type="dxa" w:w="2880"/>
+          </w:tcPr>
+          <w:p>
+            <w:r>
+              <w:rPr>
+                <w:b/>
+              </w:rPr>
+              <w:t>User-set</w:t>
+            </w:r>
+          </w:p>
+        </w:tc>
+      </w:tr>
+      <w:tr>
+        <w:tc>
+          <w:tcPr>
+            <w:tcW w:type="dxa" w:w="2880"/>
+          </w:tcPr>
+          <w:p>
+            <w:r>
+              <w:t>Maximum visits per day</w:t>
+            </w:r>
+          </w:p>
+        </w:tc>
+        <w:tc>
+          <w:tcPr>
+            <w:tcW w:type="dxa" w:w="2880"/>
+          </w:tcPr>
+          <w:p>
+            <w:r>
+              <w:t>Daily workload ceiling per rep</w:t>
+            </w:r>
+          </w:p>
+        </w:tc>
+        <w:tc>
+          <w:tcPr>
+            <w:tcW w:type="dxa" w:w="2880"/>
+          </w:tcPr>
+          <w:p>
+            <w:r>
+              <w:rPr>
+                <w:b/>
+              </w:rPr>
+              <w:t>User-set</w:t>
+            </w:r>
+          </w:p>
+        </w:tc>
+      </w:tr>
+      <w:tr>
+        <w:tc>
+          <w:tcPr>
+            <w:tcW w:type="dxa" w:w="2880"/>
+          </w:tcPr>
+          <w:p>
+            <w:r>
+              <w:t>Maximum visits per week</w:t>
+            </w:r>
+          </w:p>
+        </w:tc>
+        <w:tc>
+          <w:tcPr>
+            <w:tcW w:type="dxa" w:w="2880"/>
+          </w:tcPr>
+          <w:p>
+            <w:r>
+              <w:t>Weekly workload ceiling per rep</w:t>
+            </w:r>
+          </w:p>
+        </w:tc>
+        <w:tc>
+          <w:tcPr>
+            <w:tcW w:type="dxa" w:w="2880"/>
+          </w:tcPr>
+          <w:p>
+            <w:r>
+              <w:rPr>
+                <w:b/>
+              </w:rPr>
+              <w:t>User-set</w:t>
+            </w:r>
+          </w:p>
+        </w:tc>
+      </w:tr>
+      <w:tr>
+        <w:tc>
+          <w:tcPr>
+            <w:tcW w:type="dxa" w:w="2880"/>
+          </w:tcPr>
+          <w:p>
+            <w:r>
+              <w:t>Target sales load</w:t>
+            </w:r>
+          </w:p>
+        </w:tc>
+        <w:tc>
+          <w:tcPr>
+            <w:tcW w:type="dxa" w:w="2880"/>
+          </w:tcPr>
+          <w:p>
+            <w:r>
+              <w:t>Sales-value target/ceiling per route</w:t>
+            </w:r>
+          </w:p>
+        </w:tc>
+        <w:tc>
+          <w:tcPr>
+            <w:tcW w:type="dxa" w:w="2880"/>
+          </w:tcPr>
+          <w:p>
+            <w:r>
+              <w:rPr>
+                <w:b/>
+              </w:rPr>
+              <w:t>User-set</w:t>
+            </w:r>
+          </w:p>
+        </w:tc>
+      </w:tr>
+      <w:tr>
+        <w:tc>
+          <w:tcPr>
+            <w:tcW w:type="dxa" w:w="2880"/>
+          </w:tcPr>
+          <w:p>
+            <w:r>
+              <w:t>Route count</w:t>
+            </w:r>
+          </w:p>
+        </w:tc>
+        <w:tc>
+          <w:tcPr>
+            <w:tcW w:type="dxa" w:w="2880"/>
+          </w:tcPr>
+          <w:p>
+            <w:r>
+              <w:t>Number of routes to generate</w:t>
+            </w:r>
+          </w:p>
+        </w:tc>
+        <w:tc>
+          <w:tcPr>
+            <w:tcW w:type="dxa" w:w="2880"/>
+          </w:tcPr>
+          <w:p>
+            <w:r>
+              <w:rPr>
+                <w:b/>
+              </w:rPr>
+              <w:t>User-set OR auto-calculated</w:t>
+            </w:r>
+          </w:p>
+        </w:tc>
+      </w:tr>
+    </w:tbl>
+    <w:p/>
+    <w:p>
+      <w:r>
+        <w:rPr>
+          <w:b/>
+        </w:rPr>
+        <w:t>Auto-calculate route count:</w:t>
+      </w:r>
+      <w:r>
+        <w:t xml:space="preserve"> when the user does not fix a route count, the optimizer</w:t>
+      </w:r>
+    </w:p>
+    <w:p>
+      <w:r>
+        <w:t xml:space="preserve">derives it from the constraints + the selected customer set's </w:t>
+      </w:r>
+      <w:r>
+        <w:rPr>
+          <w:b/>
+        </w:rPr>
+        <w:t>visit workload</w:t>
+      </w:r>
+      <w:r>
+        <w:t xml:space="preserve"> (not</w:t>
+      </w:r>
+    </w:p>
+    <w:p>
+      <w:r>
+        <w:t xml:space="preserve">customer count) — e.g. </w:t>
+      </w:r>
+      <w:r>
+        <w:rPr>
+          <w:rFonts w:ascii="Consolas" w:hAnsi="Consolas"/>
+          <w:sz w:val="19"/>
+        </w:rPr>
+        <w:t>ceil(total weekly visits / (max visits per day × working days))</w:t>
+      </w:r>
+      <w:r>
+        <w:t>,</w:t>
+      </w:r>
+    </w:p>
+    <w:p>
+      <w:r>
+        <w:t>also respecting max-customers-per-route and target sales load. Conversely, when route</w:t>
+      </w:r>
+    </w:p>
+    <w:p>
+      <w:r>
+        <w:t>count is fixed, per-route targets are derived. The two modes are duals; neither hardcodes</w:t>
+      </w:r>
+    </w:p>
+    <w:p>
+      <w:r>
+        <w:t>a count.</w:t>
+      </w:r>
+    </w:p>
+    <w:p>
+      <w:r>
+        <w:rPr>
+          <w:b/>
+        </w:rPr>
+        <w:t>Targets vs. caps:</w:t>
+      </w:r>
+      <w:r>
+        <w:t xml:space="preserve"> "target" values are soft objectives the balancer optimizes toward;</w:t>
+      </w:r>
+    </w:p>
+    <w:p>
+      <w:r>
+        <w:t>"maximum" values are hard constraints it must never exceed. Both are data, supplied per</w:t>
+      </w:r>
+    </w:p>
+    <w:p>
+      <w:r>
+        <w:t>optimization run and storable as reusable company templates (consistent with the</w:t>
+      </w:r>
+    </w:p>
+    <w:p>
+      <w:r>
+        <w:t>no-hardcoded-values principle used in CJ-1 frequency rules).</w:t>
+      </w:r>
+    </w:p>
     <w:p>
       <w:pPr>
         <w:pStyle w:val="Heading2"/>

</xml_diff>

<commit_message>
docs: Route Optimization Studio — standalone product mode + planning-surface refinements
Roadmap only (no implementation):
- §8 Deployment Model — Standalone Product: design the Studio to run both as an
  embedded VANTORA module and as a standalone SaaS usable without Sales/Inventory/
  Collections/ERP modules. Self-sufficient upload-driven inputs, decoupled engine
  boundary (single route data model + FR-1 value model), optional Apply, Excel as
  the portability boundary (Export ≡ Journey-Plan import, §4a). Added phase RO-10.
- §7 refinements: click-to-inspect now shows name/route/salesman/supervisor/visit
  day/frequency/coverage status/workload/sales value; drag & drop available from
  route boards, calendar view, and map view; live preview also recomputes sales
  load.

Co-Authored-By: Claude Opus 4.8 (1M context) <noreply@anthropic.com>
Claude-Session: https://claude.ai/code/session_01AnB42F2fTvBjmAfvzDNk4V
</commit_message>
<xml_diff>
--- a/docs/audits/Route-Optimization-Studio-Roadmap.docx
+++ b/docs/audits/Route-Optimization-Studio-Roadmap.docx
@@ -1860,13 +1860,24 @@
     </w:p>
     <w:p>
       <w:r>
-        <w:t>Click any customer on the map to view, inline: customer details · current route assignment ·</w:t>
+        <w:t>Click any customer on the map to view, inline: **customer name · route · salesman ·</w:t>
       </w:r>
     </w:p>
     <w:p>
       <w:r>
-        <w:t xml:space="preserve">current visit day · frequency (FR resolver) · </w:t>
-      </w:r>
+        <w:t>supervisor · current visit day · frequency</w:t>
+      </w:r>
+      <w:r>
+        <w:rPr>
+          <w:b/>
+        </w:rPr>
+        <w:t xml:space="preserve"> (FR resolver) · </w:t>
+      </w:r>
+      <w:r>
+        <w:t>coverage status** (CJ-3) ·</w:t>
+      </w:r>
+    </w:p>
+    <w:p>
       <w:r>
         <w:rPr>
           <w:b/>
@@ -1874,12 +1885,21 @@
         <w:t>workload impact</w:t>
       </w:r>
       <w:r>
-        <w:t>. The map both plans and</w:t>
+        <w:t xml:space="preserve"> · </w:t>
+      </w:r>
+      <w:r>
+        <w:rPr>
+          <w:b/>
+        </w:rPr>
+        <w:t>sales value</w:t>
+      </w:r>
+      <w:r>
+        <w:t>. The map both plans and visualizes — not a reporting</w:t>
       </w:r>
     </w:p>
     <w:p>
       <w:r>
-        <w:t>visualizes — not a reporting map.</w:t>
+        <w:t>map.</w:t>
       </w:r>
     </w:p>
     <w:p>
@@ -1950,7 +1970,21 @@
     </w:p>
     <w:p>
       <w:r>
-        <w:t>Drag a customer across:</w:t>
+        <w:t xml:space="preserve">Drag a customer across </w:t>
+      </w:r>
+      <w:r>
+        <w:rPr>
+          <w:b/>
+        </w:rPr>
+        <w:t>Customer → Route · Customer → Visit Day · Customer → Salesman</w:t>
+      </w:r>
+      <w:r>
+        <w:t>,</w:t>
+      </w:r>
+    </w:p>
+    <w:p>
+      <w:r>
+        <w:t>from any of three interchangeable planning surfaces on the same dataset:</w:t>
       </w:r>
     </w:p>
     <w:p>
@@ -1961,10 +1995,10 @@
         <w:rPr>
           <w:b/>
         </w:rPr>
-        <w:t>Customer → Route</w:t>
-      </w:r>
-      <w:r>
-        <w:t xml:space="preserve"> (Route A → Route B)</w:t>
+        <w:t>Route boards</w:t>
+      </w:r>
+      <w:r>
+        <w:t xml:space="preserve"> (kanban-style per-route columns)</w:t>
       </w:r>
     </w:p>
     <w:p>
@@ -1975,10 +2009,10 @@
         <w:rPr>
           <w:b/>
         </w:rPr>
-        <w:t>Customer → Visit Day</w:t>
-      </w:r>
-      <w:r>
-        <w:t xml:space="preserve"> (Monday → Tuesday)</w:t>
+        <w:t>Calendar view</w:t>
+      </w:r>
+      <w:r>
+        <w:t xml:space="preserve"> (per-day columns, Sun–Sat)</w:t>
       </w:r>
     </w:p>
     <w:p>
@@ -1989,10 +2023,15 @@
         <w:rPr>
           <w:b/>
         </w:rPr>
-        <w:t>Customer → Salesman</w:t>
-      </w:r>
-      <w:r>
-        <w:t xml:space="preserve"> (Salesman A → Salesman B)</w:t>
+        <w:t>Map view</w:t>
+      </w:r>
+      <w:r>
+        <w:t xml:space="preserve"> (geographic)</w:t>
+      </w:r>
+    </w:p>
+    <w:p>
+      <w:r>
+        <w:t>Examples: Route A → Route B · Monday → Tuesday · Salesman A → Salesman B.</w:t>
       </w:r>
     </w:p>
     <w:p>
@@ -2055,7 +2094,21 @@
         <w:t xml:space="preserve"> · </w:t>
       </w:r>
       <w:r>
-        <w:t>conflict warnings** — all before</w:t>
+        <w:t>conflict warnings</w:t>
+      </w:r>
+      <w:r>
+        <w:rPr>
+          <w:b/>
+        </w:rPr>
+        <w:t xml:space="preserve"> · </w:t>
+      </w:r>
+      <w:r>
+        <w:t>sales</w:t>
+      </w:r>
+    </w:p>
+    <w:p>
+      <w:r>
+        <w:t>load** (§7.8) — all before</w:t>
       </w:r>
     </w:p>
     <w:p>
@@ -2739,7 +2792,341 @@
         <w:rPr>
           <w:color w:val="1F497D"/>
         </w:rPr>
-        <w:t>8. Indicative Phasing (when scheduled)</w:t>
+        <w:t>8. Deployment Model — Standalone Product</w:t>
+      </w:r>
+    </w:p>
+    <w:p>
+      <w:r>
+        <w:t xml:space="preserve">The Studio should be designed to operate in </w:t>
+      </w:r>
+      <w:r>
+        <w:rPr>
+          <w:b/>
+        </w:rPr>
+        <w:t>two modes from one codebase</w:t>
+      </w:r>
+      <w:r>
+        <w:t>:</w:t>
+      </w:r>
+    </w:p>
+    <w:p>
+      <w:pPr>
+        <w:pStyle w:val="ListNumber"/>
+      </w:pPr>
+      <w:r>
+        <w:rPr>
+          <w:b/>
+        </w:rPr>
+        <w:t>Embedded VANTORA module</w:t>
+      </w:r>
+      <w:r>
+        <w:t xml:space="preserve"> — integrated with the platform (applies into the Journey</w:t>
+      </w:r>
+    </w:p>
+    <w:p>
+      <w:r>
+        <w:t>Plan Engine, reads live customer/sales/coverage data).</w:t>
+      </w:r>
+    </w:p>
+    <w:p>
+      <w:pPr>
+        <w:pStyle w:val="ListNumber"/>
+      </w:pPr>
+      <w:r>
+        <w:rPr>
+          <w:b/>
+        </w:rPr>
+        <w:t>Standalone SaaS / service offering</w:t>
+      </w:r>
+      <w:r>
+        <w:t xml:space="preserve"> — a self-contained product usable **even when</w:t>
+      </w:r>
+    </w:p>
+    <w:p>
+      <w:r>
+        <w:t>Sales, Inventory, Collections, and other ERP modules are not enabled.**</w:t>
+      </w:r>
+    </w:p>
+    <w:p>
+      <w:r>
+        <w:rPr>
+          <w:b/>
+        </w:rPr>
+        <w:t>Standalone workflow:</w:t>
+      </w:r>
+    </w:p>
+    <w:p>
+      <w:pPr>
+        <w:ind w:left="240"/>
+      </w:pPr>
+      <w:r>
+        <w:rPr>
+          <w:rFonts w:ascii="Consolas" w:hAnsi="Consolas"/>
+          <w:sz w:val="18"/>
+        </w:rPr>
+        <w:t>Upload Customer Data → Set Optimization Rules → Generate Route Scenarios → Map Planning</w:t>
+        <w:br/>
+        <w:t xml:space="preserve">  → Drag &amp; Drop Adjustments → Scenario Comparison → Excel Export → (optional) Apply to Journey Plan</w:t>
+      </w:r>
+    </w:p>
+    <w:p>
+      <w:r>
+        <w:rPr>
+          <w:b/>
+        </w:rPr>
+        <w:t>Design implications (to honour now, so no refactor later):</w:t>
+      </w:r>
+    </w:p>
+    <w:p>
+      <w:pPr>
+        <w:pStyle w:val="ListBullet"/>
+      </w:pPr>
+      <w:r>
+        <w:rPr>
+          <w:b/>
+        </w:rPr>
+        <w:t>Self-sufficient inputs:</w:t>
+      </w:r>
+      <w:r>
+        <w:t xml:space="preserve"> the Studio must run from an </w:t>
+      </w:r>
+      <w:r>
+        <w:rPr>
+          <w:b/>
+        </w:rPr>
+        <w:t>uploaded customer dataset</w:t>
+      </w:r>
+    </w:p>
+    <w:p>
+      <w:r>
+        <w:t>(name · geo · classification · sales value · frequency · ownership) — it cannot assume</w:t>
+      </w:r>
+    </w:p>
+    <w:p>
+      <w:r>
+        <w:t>Sales/Inventory/Collections tables exist. Live ERP data is an *enrichment*, not a</w:t>
+      </w:r>
+    </w:p>
+    <w:p>
+      <w:r>
+        <w:t>prerequisite.</w:t>
+      </w:r>
+    </w:p>
+    <w:p>
+      <w:pPr>
+        <w:pStyle w:val="ListBullet"/>
+      </w:pPr>
+      <w:r>
+        <w:rPr>
+          <w:b/>
+        </w:rPr>
+        <w:t>Decoupled core:</w:t>
+      </w:r>
+      <w:r>
+        <w:t xml:space="preserve"> the optimization + balancing + scenario engine depends only on the</w:t>
+      </w:r>
+    </w:p>
+    <w:p>
+      <w:r>
+        <w:rPr>
+          <w:b/>
+        </w:rPr>
+        <w:t>single route dataset model</w:t>
+      </w:r>
+      <w:r>
+        <w:t xml:space="preserve"> (§4a) and the </w:t>
+      </w:r>
+      <w:r>
+        <w:rPr>
+          <w:b/>
+        </w:rPr>
+        <w:t>FR-1 frequency value model</w:t>
+      </w:r>
+      <w:r>
+        <w:t>, never on ERP</w:t>
+      </w:r>
+    </w:p>
+    <w:p>
+      <w:r>
+        <w:t xml:space="preserve">module internals. Sales value, coverage, ownership arrive as </w:t>
+      </w:r>
+      <w:r>
+        <w:rPr>
+          <w:b/>
+        </w:rPr>
+        <w:t>optional columns/layers</w:t>
+      </w:r>
+    </w:p>
+    <w:p>
+      <w:r>
+        <w:t>that degrade gracefully when absent.</w:t>
+      </w:r>
+    </w:p>
+    <w:p>
+      <w:pPr>
+        <w:pStyle w:val="ListBullet"/>
+      </w:pPr>
+      <w:r>
+        <w:rPr>
+          <w:b/>
+        </w:rPr>
+        <w:t>Optional Apply:</w:t>
+      </w:r>
+      <w:r>
+        <w:t xml:space="preserve"> "Apply to Journey Plan" is the *only* step that requires the embedded</w:t>
+      </w:r>
+    </w:p>
+    <w:p>
+      <w:r>
+        <w:t xml:space="preserve">platform; in standalone mode the terminal action is </w:t>
+      </w:r>
+      <w:r>
+        <w:rPr>
+          <w:b/>
+        </w:rPr>
+        <w:t>Excel Export</w:t>
+      </w:r>
+      <w:r>
+        <w:t xml:space="preserve"> (same single-model</w:t>
+      </w:r>
+    </w:p>
+    <w:p>
+      <w:r>
+        <w:t>schema, §4a), keeping the two modes on one data contract.</w:t>
+      </w:r>
+    </w:p>
+    <w:p>
+      <w:pPr>
+        <w:pStyle w:val="ListBullet"/>
+      </w:pPr>
+      <w:r>
+        <w:rPr>
+          <w:b/>
+        </w:rPr>
+        <w:t>Excel as the portability boundary:</w:t>
+      </w:r>
+      <w:r>
+        <w:t xml:space="preserve"> because Export ≡ Journey-Plan import (§4a), a</w:t>
+      </w:r>
+    </w:p>
+    <w:p>
+      <w:r>
+        <w:t>standalone customer can hand the exported file to a VANTORA tenant and Apply it unchanged.</w:t>
+      </w:r>
+    </w:p>
+    <w:p>
+      <w:pPr>
+        <w:ind w:left="360"/>
+      </w:pPr>
+      <w:r>
+        <w:rPr>
+          <w:i/>
+        </w:rPr>
+      </w:r>
+      <w:r>
+        <w:rPr>
+          <w:b/>
+          <w:i/>
+        </w:rPr>
+        <w:t>Reuse:</w:t>
+      </w:r>
+      <w:r>
+        <w:rPr>
+          <w:i/>
+        </w:rPr>
+        <w:t xml:space="preserve"> the engines (</w:t>
+      </w:r>
+      <w:r>
+        <w:rPr>
+          <w:rFonts w:ascii="Consolas" w:hAnsi="Consolas"/>
+          <w:i/>
+          <w:sz w:val="19"/>
+        </w:rPr>
+        <w:t>optimize.ts</w:t>
+      </w:r>
+      <w:r>
+        <w:rPr>
+          <w:i/>
+        </w:rPr>
+        <w:t xml:space="preserve">, </w:t>
+      </w:r>
+      <w:r>
+        <w:rPr>
+          <w:rFonts w:ascii="Consolas" w:hAnsi="Consolas"/>
+          <w:i/>
+          <w:sz w:val="19"/>
+        </w:rPr>
+        <w:t>territory.ts</w:t>
+      </w:r>
+      <w:r>
+        <w:rPr>
+          <w:i/>
+        </w:rPr>
+        <w:t xml:space="preserve">, </w:t>
+      </w:r>
+      <w:r>
+        <w:rPr>
+          <w:rFonts w:ascii="Consolas" w:hAnsi="Consolas"/>
+          <w:i/>
+          <w:sz w:val="19"/>
+        </w:rPr>
+        <w:t>generator.ts</w:t>
+      </w:r>
+      <w:r>
+        <w:rPr>
+          <w:i/>
+        </w:rPr>
+        <w:t>, FR resolver,</w:t>
+      </w:r>
+    </w:p>
+    <w:p>
+      <w:pPr>
+        <w:ind w:left="360"/>
+      </w:pPr>
+      <w:r>
+        <w:rPr>
+          <w:i/>
+        </w:rPr>
+      </w:r>
+      <w:r>
+        <w:rPr>
+          <w:i/>
+        </w:rPr>
+        <w:t>conflict detection) are already pure/data-driven, so a standalone packaging is mostly a</w:t>
+      </w:r>
+    </w:p>
+    <w:p>
+      <w:pPr>
+        <w:ind w:left="360"/>
+      </w:pPr>
+      <w:r>
+        <w:rPr>
+          <w:i/>
+        </w:rPr>
+      </w:r>
+      <w:r>
+        <w:rPr>
+          <w:b/>
+          <w:i/>
+        </w:rPr>
+        <w:t>boundary + ingestion (upload) + licensing</w:t>
+      </w:r>
+      <w:r>
+        <w:rPr>
+          <w:i/>
+        </w:rPr>
+        <w:t xml:space="preserve"> concern, not a re-implementation.</w:t>
+      </w:r>
+    </w:p>
+    <w:p>
+      <w:pPr>
+        <w:pStyle w:val="Heading2"/>
+      </w:pPr>
+      <w:r>
+        <w:rPr>
+          <w:color w:val="1F497D"/>
+        </w:rPr>
+        <w:t>9. Indicative Phasing (when scheduled)</w:t>
       </w:r>
     </w:p>
     <w:tbl>
@@ -2979,6 +3366,28 @@
           <w:p>
             <w:r>
               <w:t>Territory Ownership Layer (§7.9): colour-coded salesman/supervisor/area/region ownership, boundaries, out-of-territory detection</w:t>
+            </w:r>
+          </w:p>
+        </w:tc>
+      </w:tr>
+      <w:tr>
+        <w:tc>
+          <w:tcPr>
+            <w:tcW w:type="dxa" w:w="4320"/>
+          </w:tcPr>
+          <w:p>
+            <w:r>
+              <w:t>RO-10</w:t>
+            </w:r>
+          </w:p>
+        </w:tc>
+        <w:tc>
+          <w:tcPr>
+            <w:tcW w:type="dxa" w:w="4320"/>
+          </w:tcPr>
+          <w:p>
+            <w:r>
+              <w:t>Standalone packaging (§8): customer-data upload/ingestion, decoupled engine boundary, Excel-export terminal mode, optional Apply, licensing</w:t>
             </w:r>
           </w:p>
         </w:tc>

</xml_diff>

<commit_message>
docs: Simple Mode principle — every advanced capability has a zero-config default
Roadmap/strategy only. Records the cross-cutting product principle that a sales
manager must generate a usable territory plan in minutes without understanding
optimization theory, weights, or technical settings.

- Route Optimization Studio §1b: Simple vs Advanced mode table; engine-derived
  defaults, progressive disclosure, plain-language results, one-click happy path,
  safe escalation (Simple output is real engine output).
- TIS Strategy §1a: same principle elevated to a family-wide requirement across
  Audit / Sizing / Optimization / Planning, with an explicit acceptance bar.

Co-Authored-By: Claude Opus 4.8 (1M context) <noreply@anthropic.com>
Claude-Session: https://claude.ai/code/session_01AnB42F2fTvBjmAfvzDNk4V
</commit_message>
<xml_diff>
--- a/docs/audits/Route-Optimization-Studio-Roadmap.docx
+++ b/docs/audits/Route-Optimization-Studio-Roadmap.docx
@@ -827,6 +827,414 @@
     <w:p>
       <w:r>
         <w:t>no-hardcoded-values principle used in CJ-1 frequency rules).</w:t>
+      </w:r>
+    </w:p>
+    <w:p>
+      <w:pPr>
+        <w:pStyle w:val="Heading2"/>
+      </w:pPr>
+      <w:r>
+        <w:rPr>
+          <w:color w:val="1F497D"/>
+        </w:rPr>
+        <w:t xml:space="preserve">1b. Simple Mode vs Advanced Mode — </w:t>
+      </w:r>
+      <w:r>
+        <w:rPr>
+          <w:b/>
+          <w:color w:val="1F497D"/>
+        </w:rPr>
+        <w:t>every advanced capability has a simple mode</w:t>
+      </w:r>
+    </w:p>
+    <w:p>
+      <w:r>
+        <w:rPr>
+          <w:b/>
+        </w:rPr>
+        <w:t>Product principle (applies to the whole family):</w:t>
+      </w:r>
+      <w:r>
+        <w:t xml:space="preserve"> a sales manager must be able to generate</w:t>
+      </w:r>
+    </w:p>
+    <w:p>
+      <w:r>
+        <w:t xml:space="preserve">a </w:t>
+      </w:r>
+      <w:r>
+        <w:rPr>
+          <w:b/>
+        </w:rPr>
+        <w:t>usable territory plan in minutes</w:t>
+      </w:r>
+      <w:r>
+        <w:t xml:space="preserve"> without understanding optimization theory, weights, or</w:t>
+      </w:r>
+    </w:p>
+    <w:p>
+      <w:r>
+        <w:t>technical settings. Advanced power is opt-in, never a prerequisite.</w:t>
+      </w:r>
+    </w:p>
+    <w:tbl>
+      <w:tblPr>
+        <w:tblStyle w:val="LightGrid-Accent1"/>
+        <w:tblW w:type="auto" w:w="0"/>
+        <w:jc w:val="center"/>
+        <w:tblLook w:firstColumn="1" w:firstRow="1" w:lastColumn="0" w:lastRow="0" w:noHBand="0" w:noVBand="1" w:val="04A0"/>
+      </w:tblPr>
+      <w:tblGrid>
+        <w:gridCol w:w="2880"/>
+        <w:gridCol w:w="2880"/>
+        <w:gridCol w:w="2880"/>
+      </w:tblGrid>
+      <w:tr>
+        <w:tc>
+          <w:tcPr>
+            <w:tcW w:type="dxa" w:w="2880"/>
+            <w:shd w:val="clear" w:fill="1F497D"/>
+          </w:tcPr>
+          <w:p/>
+        </w:tc>
+        <w:tc>
+          <w:tcPr>
+            <w:tcW w:type="dxa" w:w="2880"/>
+            <w:shd w:val="clear" w:fill="1F497D"/>
+          </w:tcPr>
+          <w:p>
+            <w:r>
+              <w:rPr>
+                <w:b/>
+                <w:color w:val="FFFFFF"/>
+              </w:rPr>
+              <w:t>Simple Mode (default)</w:t>
+            </w:r>
+          </w:p>
+        </w:tc>
+        <w:tc>
+          <w:tcPr>
+            <w:tcW w:type="dxa" w:w="2880"/>
+            <w:shd w:val="clear" w:fill="1F497D"/>
+          </w:tcPr>
+          <w:p>
+            <w:r>
+              <w:rPr>
+                <w:b/>
+                <w:color w:val="FFFFFF"/>
+              </w:rPr>
+              <w:t>Advanced Mode (opt-in)</w:t>
+            </w:r>
+          </w:p>
+        </w:tc>
+      </w:tr>
+      <w:tr>
+        <w:tc>
+          <w:tcPr>
+            <w:tcW w:type="dxa" w:w="2880"/>
+          </w:tcPr>
+          <w:p>
+            <w:r>
+              <w:t>Inputs</w:t>
+            </w:r>
+          </w:p>
+        </w:tc>
+        <w:tc>
+          <w:tcPr>
+            <w:tcW w:type="dxa" w:w="2880"/>
+          </w:tcPr>
+          <w:p>
+            <w:r>
+              <w:t>Pick customers + working days. That's it.</w:t>
+            </w:r>
+          </w:p>
+        </w:tc>
+        <w:tc>
+          <w:tcPr>
+            <w:tcW w:type="dxa" w:w="2880"/>
+          </w:tcPr>
+          <w:p>
+            <w:r>
+              <w:t>Full constraint set (§1a) + objective weights (§2)</w:t>
+            </w:r>
+          </w:p>
+        </w:tc>
+      </w:tr>
+      <w:tr>
+        <w:tc>
+          <w:tcPr>
+            <w:tcW w:type="dxa" w:w="2880"/>
+          </w:tcPr>
+          <w:p>
+            <w:r>
+              <w:t>Route count</w:t>
+            </w:r>
+          </w:p>
+        </w:tc>
+        <w:tc>
+          <w:tcPr>
+            <w:tcW w:type="dxa" w:w="2880"/>
+          </w:tcPr>
+          <w:p>
+            <w:r>
+              <w:t>Auto-calculated from workload</w:t>
+            </w:r>
+          </w:p>
+        </w:tc>
+        <w:tc>
+          <w:tcPr>
+            <w:tcW w:type="dxa" w:w="2880"/>
+          </w:tcPr>
+          <w:p>
+            <w:r>
+              <w:t>User-set or auto</w:t>
+            </w:r>
+          </w:p>
+        </w:tc>
+      </w:tr>
+      <w:tr>
+        <w:tc>
+          <w:tcPr>
+            <w:tcW w:type="dxa" w:w="2880"/>
+          </w:tcPr>
+          <w:p>
+            <w:r>
+              <w:t>Balancing</w:t>
+            </w:r>
+          </w:p>
+        </w:tc>
+        <w:tc>
+          <w:tcPr>
+            <w:tcW w:type="dxa" w:w="2880"/>
+          </w:tcPr>
+          <w:p>
+            <w:r>
+              <w:t>Sensible default blend (workload + distance)</w:t>
+            </w:r>
+          </w:p>
+        </w:tc>
+        <w:tc>
+          <w:tcPr>
+            <w:tcW w:type="dxa" w:w="2880"/>
+          </w:tcPr>
+          <w:p>
+            <w:r>
+              <w:t>User-tuned weights (count · workload · sales · geo · capacity)</w:t>
+            </w:r>
+          </w:p>
+        </w:tc>
+      </w:tr>
+      <w:tr>
+        <w:tc>
+          <w:tcPr>
+            <w:tcW w:type="dxa" w:w="2880"/>
+          </w:tcPr>
+          <w:p>
+            <w:r>
+              <w:t>Output</w:t>
+            </w:r>
+          </w:p>
+        </w:tc>
+        <w:tc>
+          <w:tcPr>
+            <w:tcW w:type="dxa" w:w="2880"/>
+          </w:tcPr>
+          <w:p>
+            <w:r>
+              <w:t>One recommended plan + preview</w:t>
+            </w:r>
+          </w:p>
+        </w:tc>
+        <w:tc>
+          <w:tcPr>
+            <w:tcW w:type="dxa" w:w="2880"/>
+          </w:tcPr>
+          <w:p>
+            <w:r>
+              <w:t>Multiple scenarios + compare</w:t>
+            </w:r>
+          </w:p>
+        </w:tc>
+      </w:tr>
+      <w:tr>
+        <w:tc>
+          <w:tcPr>
+            <w:tcW w:type="dxa" w:w="2880"/>
+          </w:tcPr>
+          <w:p>
+            <w:r>
+              <w:t>Vocabulary</w:t>
+            </w:r>
+          </w:p>
+        </w:tc>
+        <w:tc>
+          <w:tcPr>
+            <w:tcW w:type="dxa" w:w="2880"/>
+          </w:tcPr>
+          <w:p>
+            <w:r>
+              <w:t>Plain language ("balanced by visits &amp; travel")</w:t>
+            </w:r>
+          </w:p>
+        </w:tc>
+        <w:tc>
+          <w:tcPr>
+            <w:tcW w:type="dxa" w:w="2880"/>
+          </w:tcPr>
+          <w:p>
+            <w:r>
+              <w:t>Technical (weights, caps, scores)</w:t>
+            </w:r>
+          </w:p>
+        </w:tc>
+      </w:tr>
+    </w:tbl>
+    <w:p/>
+    <w:p>
+      <w:r>
+        <w:rPr>
+          <w:b/>
+        </w:rPr>
+        <w:t>How Simple Mode stays smart without exposing knobs:</w:t>
+      </w:r>
+    </w:p>
+    <w:p>
+      <w:pPr>
+        <w:pStyle w:val="ListBullet"/>
+      </w:pPr>
+      <w:r>
+        <w:rPr>
+          <w:b/>
+        </w:rPr>
+        <w:t>Defaults come from the engines, not the user</w:t>
+      </w:r>
+      <w:r>
+        <w:t xml:space="preserve"> — frequency/workload from the FR resolver,</w:t>
+      </w:r>
+    </w:p>
+    <w:p>
+      <w:r>
+        <w:t>priority from A/B/C grade, capacity from rep defaults, distance from geo. The optimizer is</w:t>
+      </w:r>
+    </w:p>
+    <w:p>
+      <w:r>
+        <w:t>fully configured out of the box; Advanced Mode only *reveals* those defaults for tuning.</w:t>
+      </w:r>
+    </w:p>
+    <w:p>
+      <w:pPr>
+        <w:pStyle w:val="ListBullet"/>
+      </w:pPr>
+      <w:r>
+        <w:rPr>
+          <w:b/>
+        </w:rPr>
+        <w:t>Progressive disclosure</w:t>
+      </w:r>
+      <w:r>
+        <w:t xml:space="preserve"> — one primary action ("Generate Plan") up front; constraints,</w:t>
+      </w:r>
+    </w:p>
+    <w:p>
+      <w:r>
+        <w:t>weights, and scenarios live behind an "Advanced" affordance. Nothing technical on the</w:t>
+      </w:r>
+    </w:p>
+    <w:p>
+      <w:r>
+        <w:t>default screen.</w:t>
+      </w:r>
+    </w:p>
+    <w:p>
+      <w:pPr>
+        <w:pStyle w:val="ListBullet"/>
+      </w:pPr>
+      <w:r>
+        <w:rPr>
+          <w:b/>
+        </w:rPr>
+        <w:t>Plain-language results</w:t>
+      </w:r>
+      <w:r>
+        <w:t xml:space="preserve"> — outputs read as "≈120 stops/route, balanced by visits and</w:t>
+      </w:r>
+    </w:p>
+    <w:p>
+      <w:r>
+        <w:t>travel time," not raw scores. Scores/weights appear only in Advanced.</w:t>
+      </w:r>
+    </w:p>
+    <w:p>
+      <w:pPr>
+        <w:pStyle w:val="ListBullet"/>
+      </w:pPr>
+      <w:r>
+        <w:rPr>
+          <w:b/>
+        </w:rPr>
+        <w:t>One-click happy path</w:t>
+      </w:r>
+      <w:r>
+        <w:t xml:space="preserve"> — </w:t>
+      </w:r>
+      <w:r>
+        <w:rPr>
+          <w:rFonts w:ascii="Consolas" w:hAnsi="Consolas"/>
+          <w:sz w:val="19"/>
+        </w:rPr>
+        <w:t>Select customers → Generate → Preview → Apply/Export</w:t>
+      </w:r>
+      <w:r>
+        <w:t>. A</w:t>
+      </w:r>
+    </w:p>
+    <w:p>
+      <w:r>
+        <w:t>manager never has to touch a weight to get a usable plan.</w:t>
+      </w:r>
+    </w:p>
+    <w:p>
+      <w:pPr>
+        <w:pStyle w:val="ListBullet"/>
+      </w:pPr>
+      <w:r>
+        <w:rPr>
+          <w:b/>
+        </w:rPr>
+        <w:t>Safe escalation</w:t>
+      </w:r>
+      <w:r>
+        <w:t xml:space="preserve"> — Simple results are real engine output (not a lesser algorithm), so a</w:t>
+      </w:r>
+    </w:p>
+    <w:p>
+      <w:r>
+        <w:t>manager can switch to Advanced and keep refining the *same* plan — no rework.</w:t>
+      </w:r>
+    </w:p>
+    <w:p>
+      <w:r>
+        <w:t xml:space="preserve">This principle is </w:t>
+      </w:r>
+      <w:r>
+        <w:rPr>
+          <w:b/>
+        </w:rPr>
+        <w:t>cross-cutting</w:t>
+      </w:r>
+      <w:r>
+        <w:t>: it governs Route Optimization, Visual Territory Planning,</w:t>
+      </w:r>
+    </w:p>
+    <w:p>
+      <w:r>
+        <w:t>Territory Audit, and Sales Force Sizing alike (see TIS strategy). Each stage ships a</w:t>
+      </w:r>
+    </w:p>
+    <w:p>
+      <w:r>
+        <w:t>zero-configuration default before any expert controls.</w:t>
       </w:r>
     </w:p>
     <w:p>

</xml_diff>